<commit_message>
Kim12_tema-2-unite-sonu-sorulari: gorsel alanlarina Shutter onizlemeleri yerlestirildi (2.3 bicimi)
</commit_message>
<xml_diff>
--- a/sorular/Kim12_tema-2-unite-sonu-sorulari.docx
+++ b/sorular/Kim12_tema-2-unite-sonu-sorulari.docx
@@ -110,85 +110,59 @@
         <w:t xml:space="preserve">Elif, yaz tatilinde Ankara’daki bir sanayi bölgesinde metal kesme ve kaynak işleri yapan bir atölyede staj yapmaktadır. Atölyede metaller, etin (asetilen) gazının saf oksijenle yakıldığı ve 3000 °C’nin üzerinde sıcaklığa ulaşan oksi-asetilen alevi ile kesilmektedir. Usta, Elif’e asetilen tüplerinin içinin gözenekli bir dolgu maddesiyle dolu olduğunu, etinin bu dolguya emdirilmiş aseton içinde çözünmüş hâlde güvenle saklandığını anlatır. Ayrıca oksijen vanası yeterince açılmadığında alevin sarı renkli ve çok isli olduğunu gösterir.</w:t>
       </w:r>
     </w:p>
-    <w:tbl>
-      <w:tblPr>
-        <w:tblW w:w="9000" w:type="dxa"/>
+    <w:p>
+      <w:pPr>
         <w:jc w:val="center"/>
-        <w:tblBorders>
-          <w:top w:val="single" w:sz="8" w:space="0" w:color="7F7F7F"/>
-          <w:left w:val="single" w:sz="8" w:space="0" w:color="7F7F7F"/>
-          <w:bottom w:val="single" w:sz="8" w:space="0" w:color="7F7F7F"/>
-          <w:right w:val="single" w:sz="8" w:space="0" w:color="7F7F7F"/>
-        </w:tblBorders>
-      </w:tblPr>
-      <w:tblGrid>
-        <w:gridCol w:w="9000"/>
-      </w:tblGrid>
-      <w:tr>
-        <w:tc>
-          <w:tcPr>
-            <w:tcW w:w="9000" w:type="dxa"/>
-            <w:shd w:val="clear" w:color="auto" w:fill="EDEDED"/>
-          </w:tcPr>
-          <w:p>
-            <w:pPr>
-              <w:jc w:val="both"/>
-              <w:rPr>
-                <w:rFonts w:ascii="Times New Roman" w:hAnsi="Times New Roman" w:cs="Times New Roman"/>
-                <w:lang w:val="tr-TR"/>
-              </w:rPr>
-            </w:pPr>
-            <w:r>
-              <w:rPr>
-                <w:rFonts w:ascii="Times New Roman" w:hAnsi="Times New Roman" w:cs="Times New Roman"/>
-                <w:lang w:val="tr-TR"/>
-              </w:rPr>
-              <w:t xml:space="preserve">GÖRSEL ALANI (Shutterstock)</w:t>
-            </w:r>
-          </w:p>
-          <w:p>
-            <w:pPr>
-              <w:jc w:val="both"/>
-              <w:rPr>
-                <w:rFonts w:ascii="Times New Roman" w:hAnsi="Times New Roman" w:cs="Times New Roman"/>
-                <w:lang w:val="tr-TR"/>
-              </w:rPr>
-            </w:pPr>
-            <w:r>
-              <w:rPr>
-                <w:rFonts w:ascii="Times New Roman" w:hAnsi="Times New Roman" w:cs="Times New Roman"/>
-                <w:lang w:val="tr-TR"/>
-              </w:rPr>
-              <w:t xml:space="preserve">Tarif: Koruyucu maske ve eldivenli bir ustanın oksi-asetilen şalomasıyla çelik levha kesmesi; kıvılcımlar ve arka planda kırmızı (asetilen) ve mavi (oksijen) tüpler (marka/logo görünmesin).</w:t>
-            </w:r>
-          </w:p>
-          <w:p>
-            <w:pPr>
-              <w:jc w:val="both"/>
-              <w:rPr>
-                <w:rFonts w:ascii="Times New Roman" w:hAnsi="Times New Roman" w:cs="Times New Roman"/>
-                <w:lang w:val="tr-TR"/>
-              </w:rPr>
-            </w:pPr>
-            <w:r>
-              <w:rPr>
-                <w:rFonts w:ascii="Times New Roman" w:hAnsi="Times New Roman" w:cs="Times New Roman"/>
-                <w:lang w:val="tr-TR"/>
-              </w:rPr>
-              <w:t xml:space="preserve">Shutter ID: 2376690545 (fotoğraf) — Welder using an oxy-acetylene cutting torch</w:t>
-            </w:r>
-          </w:p>
-        </w:tc>
-      </w:tr>
-    </w:tbl>
-    <w:p>
-      <w:pPr>
-        <w:jc w:val="both"/>
-        <w:rPr>
-          <w:rFonts w:ascii="Times New Roman" w:hAnsi="Times New Roman" w:cs="Times New Roman"/>
-          <w:lang w:val="tr-TR"/>
-        </w:rPr>
-      </w:pPr>
+      </w:pPr>
+      <w:r>
+        <w:drawing>
+          <wp:inline xmlns:a="http://schemas.openxmlformats.org/drawingml/2006/main" xmlns:pic="http://schemas.openxmlformats.org/drawingml/2006/picture">
+            <wp:extent cx="3402340" cy="2520000"/>
+            <wp:docPr id="900006" name="Picture 900006"/>
+            <wp:cNvGraphicFramePr>
+              <a:graphicFrameLocks noChangeAspect="1"/>
+            </wp:cNvGraphicFramePr>
+            <a:graphic>
+              <a:graphicData uri="http://schemas.openxmlformats.org/drawingml/2006/picture">
+                <pic:pic>
+                  <pic:nvPicPr>
+                    <pic:cNvPr id="0" name="2376690545_d.jpg"/>
+                    <pic:cNvPicPr/>
+                  </pic:nvPicPr>
+                  <pic:blipFill>
+                    <a:blip r:embed="rId11"/>
+                    <a:stretch>
+                      <a:fillRect/>
+                    </a:stretch>
+                  </pic:blipFill>
+                  <pic:spPr>
+                    <a:xfrm>
+                      <a:off x="0" y="0"/>
+                      <a:ext cx="3402340" cy="2520000"/>
+                    </a:xfrm>
+                    <a:prstGeom prst="rect"/>
+                  </pic:spPr>
+                </pic:pic>
+              </a:graphicData>
+            </a:graphic>
+          </wp:inline>
+        </w:drawing>
+      </w:r>
+    </w:p>
+    <w:p>
+      <w:pPr>
+        <w:jc w:val="center"/>
+      </w:pPr>
+      <w:r>
+        <w:rPr>
+          <w:rFonts w:ascii="Times New Roman" w:hAnsi="Times New Roman" w:cs="Times New Roman"/>
+          <w:b/>
+          <w:bCs/>
+          <w:highlight w:val="yellow"/>
+          <w:lang w:val="tr-TR"/>
+        </w:rPr>
+        <w:t xml:space="preserve">Shutter id: 2376690545</w:t>
+      </w:r>
     </w:p>
     <w:p>
       <w:pPr>

</xml_diff>